<commit_message>
Replace leftover old product name inside the .docx documents
Co-Authored-By: Claude Sonnet 5.5 <noreply@anthropic.com>
Claude-Session: https://claude.ai/code/session_01H7faYg9sqiuJg5K9uTjKXz
</commit_message>
<xml_diff>
--- a/FRFRO_DEEP_ANALYSIS.docx
+++ b/FRFRO_DEEP_ANALYSIS.docx
@@ -22,7 +22,7 @@
           <w:sz w:val="52"/>
           <w:szCs w:val="52"/>
         </w:rPr>
-        <w:t xml:space="preserve">تحلیل فنی عمیق پروژه «زیبابان»</w:t>
+        <w:t xml:space="preserve">تحلیل فنی عمیق پروژه «فرفرو»</w:t>
       </w:r>
     </w:p>
     <w:p>
@@ -115,7 +115,7 @@
           <w:sz w:val="22"/>
           <w:szCs w:val="22"/>
         </w:rPr>
-        <w:t xml:space="preserve">زیبابان یک اپلیکیشن Next.js (App Router) است که چهار حوزهٔ کسب‌وکار را در یک محصول واحد ترکیب کرده: شبکهٔ اجتماعی نمایش نمونه‌کار (اکسپلور)، رزرو نوبت از سالن‌ها و آرتیست‌های مستقل، فروشگاه آنلاین لوازم آرایشی، و استودیوی تولید تصویر با هوش مصنوعی که با ارز داخلی «شل» شارژ می‌شود. پروژه به‌صورت تک‌نفره یا با کمک ابزارهای هوش مصنوعی و به‌صورت بسیار تکرارشونده (iterative) توسعه یافته — نشانه‌اش وجود نزدیک به ۲۰۰ اسکریپت آزمایشی/اصلاحی موقت در پوشهٔ scripts/ و سه سند داخلی زندهٔ ردیابی مشکلات (KNOWN_ISSUES.md، UX_ISSUES.md، UX_AUDIT_ZIBABAN.md) است که خودِ تیم توسعه نگه داشته.</w:t>
+        <w:t xml:space="preserve">فرفرو یک اپلیکیشن Next.js (App Router) است که چهار حوزهٔ کسب‌وکار را در یک محصول واحد ترکیب کرده: شبکهٔ اجتماعی نمایش نمونه‌کار (اکسپلور)، رزرو نوبت از سالن‌ها و آرتیست‌های مستقل، فروشگاه آنلاین لوازم آرایشی، و استودیوی تولید تصویر با هوش مصنوعی که با ارز داخلی «شل» شارژ می‌شود. پروژه به‌صورت تک‌نفره یا با کمک ابزارهای هوش مصنوعی و به‌صورت بسیار تکرارشونده (iterative) توسعه یافته — نشانه‌اش وجود نزدیک به ۲۰۰ اسکریپت آزمایشی/اصلاحی موقت در پوشهٔ scripts/ و سه سند داخلی زندهٔ ردیابی مشکلات (KNOWN_ISSUES.md، UX_ISSUES.md، UX_AUDIT_FRFRO.md) است که خودِ تیم توسعه نگه داشته.</w:t>
       </w:r>
     </w:p>
     <w:p>
@@ -238,7 +238,7 @@
           <w:sz w:val="22"/>
           <w:szCs w:val="22"/>
         </w:rPr>
-        <w:t xml:space="preserve">لایهٔ داده: ماژول تجربی node:sqlite (DatabaseSync) به‌جای کتابخانهٔ بالغ‌تر better-sqlite3؛ یک فایل SQLite واحد در data/zibaban.sqlite با PRAGMA journal_mode=WAL</w:t>
+        <w:t xml:space="preserve">لایهٔ داده: ماژول تجربی node:sqlite (DatabaseSync) به‌جای کتابخانهٔ بالغ‌تر better-sqlite3؛ یک فایل SQLite واحد در data/frfro.sqlite با PRAGMA journal_mode=WAL</w:t>
       </w:r>
     </w:p>
     <w:p>
@@ -1998,7 +1998,7 @@
           <w:sz w:val="22"/>
           <w:szCs w:val="22"/>
         </w:rPr>
-        <w:t xml:space="preserve">این مسیر را کاملاً از بیلد پروداکشن حذف کنید (نه فقط پشت یک if)، یا حداقل پشت یک فلگ جداگانه و صریح (مثل ZIBABAN_ENABLE_DEMO_CREDIT=1) به‌همراه لاگ حسابرسی (audit log) قرار دهید که هرگز به‌طور پیش‌فرض روشن نباشد.</w:t>
+        <w:t xml:space="preserve">این مسیر را کاملاً از بیلد پروداکشن حذف کنید (نه فقط پشت یک if)، یا حداقل پشت یک فلگ جداگانه و صریح (مثل FRFRO_ENABLE_DEMO_CREDIT=1) به‌همراه لاگ حسابرسی (audit log) قرار دهید که هرگز به‌طور پیش‌فرض روشن نباشد.</w:t>
       </w:r>
     </w:p>
     <w:p>
@@ -2565,7 +2565,7 @@
           <w:sz w:val="22"/>
           <w:szCs w:val="22"/>
         </w:rPr>
-        <w:t xml:space="preserve">data/zibaban.sqlite حدود ۱۶۸ مگابایت است (به‌همراه ~۱۰ مگابایت فایل WAL) — رقمی که برای دامنهٔ فعلی جداول (کاربران، رزروها، پیام‌ها، تراکنش‌های کیف‌پول) بسیار بزرگ به نظر می‌رسد، مخصوصاً که ستون‌های image/avatar در schema از نوع TEXT هستند (مستعد ذخیرهٔ base64 در صورت عدم استفاده از فایل/URL). گزارش UX_AUDIT_ZIBABAN.md نیز مستقل شواهدی از دادهٔ آزمایشیِ رهاشده در همین DB را ثبت کرده (عنوان‌های بی‌معنی مثل «یسشبشس»، مخاطبین انگلیسی ساختگی). امکان بازرسی مستقیم فایل در این نشست به‌دلیل محدودیت زمانیِ انتقال فایل (device shell کاربر در دسترس نبود) فراهم نشد؛ این یک فرضیه است، نه یافتهٔ تأییدشده.</w:t>
+        <w:t xml:space="preserve">data/frfro.sqlite حدود ۱۶۸ مگابایت است (به‌همراه ~۱۰ مگابایت فایل WAL) — رقمی که برای دامنهٔ فعلی جداول (کاربران، رزروها، پیام‌ها، تراکنش‌های کیف‌پول) بسیار بزرگ به نظر می‌رسد، مخصوصاً که ستون‌های image/avatar در schema از نوع TEXT هستند (مستعد ذخیرهٔ base64 در صورت عدم استفاده از فایل/URL). گزارش UX_AUDIT_FRFRO.md نیز مستقل شواهدی از دادهٔ آزمایشیِ رهاشده در همین DB را ثبت کرده (عنوان‌های بی‌معنی مثل «یسشبشس»، مخاطبین انگلیسی ساختگی). امکان بازرسی مستقیم فایل در این نشست به‌دلیل محدودیت زمانیِ انتقال فایل (device shell کاربر در دسترس نبود) فراهم نشد؛ این یک فرضیه است، نه یافتهٔ تأییدشده.</w:t>
       </w:r>
     </w:p>
     <w:p>
@@ -2737,7 +2737,7 @@
           <w:sz w:val="22"/>
           <w:szCs w:val="22"/>
         </w:rPr>
-        <w:t xml:space="preserve">شل روی دستگاه کاربر در این نشست بالا نیامد؛ بنابراین git log و git status اجرا نشدند و ادعایی دربارهٔ تعداد commitها، شاخه‌ها، یا اینکه آیا فایل‌های حجیم/حساس (مثل data/zibaban.sqlite در صورت عدم‌رعایت .gitignore در گذشته) وارد تاریخچهٔ Git شده‌اند یا نه، در این گزارش نیامده. توصیه می‌شود جداگانه git log --stat | tail و du -sh .git بررسی شود؛ اگر دیتابیس یا لاگ‌ها زمانی commit شده‌اند، فقط حذف فایل کافی نیست و پاکسازی تاریخچه (مثلاً با git filter-repo) لازم است.</w:t>
+        <w:t xml:space="preserve">شل روی دستگاه کاربر در این نشست بالا نیامد؛ بنابراین git log و git status اجرا نشدند و ادعایی دربارهٔ تعداد commitها، شاخه‌ها، یا اینکه آیا فایل‌های حجیم/حساس (مثل data/frfro.sqlite در صورت عدم‌رعایت .gitignore در گذشته) وارد تاریخچهٔ Git شده‌اند یا نه، در این گزارش نیامده. توصیه می‌شود جداگانه git log --stat | tail و du -sh .git بررسی شود؛ اگر دیتابیس یا لاگ‌ها زمانی commit شده‌اند، فقط حذف فایل کافی نیست و پاکسازی تاریخچه (مثلاً با git filter-repo) لازم است.</w:t>
       </w:r>
     </w:p>
     <w:p>
@@ -2959,7 +2959,7 @@
           <w:sz w:val="22"/>
           <w:szCs w:val="22"/>
         </w:rPr>
-        <w:t xml:space="preserve">تیم توسعه سه سند زندهٔ ردیابی مشکلات (KNOWN_ISSUES.md، UX_ISSUES.md، UX_AUDIT_ZIBABAN.md) نگه می‌دارد و مشکلات رفع‌شده را با تاریخ و روش تست مستند می‌کند — نظمی که در بسیاری پروژه‌های تک‌نفره دیده نمی‌شود.</w:t>
+        <w:t xml:space="preserve">تیم توسعه سه سند زندهٔ ردیابی مشکلات (KNOWN_ISSUES.md، UX_ISSUES.md، UX_AUDIT_FRFRO.md) نگه می‌دارد و مشکلات رفع‌شده را با تاریخ و روش تست مستند می‌کند — نظمی که در بسیاری پروژه‌های تک‌نفره دیده نمی‌شود.</w:t>
       </w:r>
     </w:p>
     <w:p>
@@ -3000,7 +3000,7 @@
           <w:sz w:val="22"/>
           <w:szCs w:val="22"/>
         </w:rPr>
-        <w:t xml:space="preserve">این پروژه از پیش یک ممیزی تجربهٔ کاربریِ ۱۹ صفحه‌ای دارد (UX_AUDIT_ZIBABAN.md) که با بازدید واقعی از اپ در دو چیدمان دسکتاپ و موبایل انجام شده. جدول زیر امتیازهای کلیدی آن را خلاصه می‌کند:</w:t>
+        <w:t xml:space="preserve">این پروژه از پیش یک ممیزی تجربهٔ کاربریِ ۱۹ صفحه‌ای دارد (UX_AUDIT_FRFRO.md) که با بازدید واقعی از اپ در دو چیدمان دسکتاپ و موبایل انجام شده. جدول زیر امتیازهای کلیدی آن را خلاصه می‌کند:</w:t>
       </w:r>
     </w:p>
     <w:tbl>
@@ -3823,7 +3823,7 @@
           <w:sz w:val="22"/>
           <w:szCs w:val="22"/>
         </w:rPr>
-        <w:t xml:space="preserve">جزئیات کامل هر صفحه، امتیاز، و اولویت رفع در فایل UX_AUDIT_ZIBABAN.md موجود در ریشهٔ پروژه ثبت شده و در این گزارش تکرار نشده تا از دوباره‌کاری پرهیز شود.</w:t>
+        <w:t xml:space="preserve">جزئیات کامل هر صفحه، امتیاز، و اولویت رفع در فایل UX_AUDIT_FRFRO.md موجود در ریشهٔ پروژه ثبت شده و در این گزارش تکرار نشده تا از دوباره‌کاری پرهیز شود.</w:t>
       </w:r>
     </w:p>
     <w:p>

</xml_diff>

<commit_message>
Replace leftover old product name inside the .docx documents (#105)
Claude-Session: https://claude.ai/code/session_01H7faYg9sqiuJg5K9uTjKXz

Co-authored-by: Claude <noreply@anthropic.com>
</commit_message>
<xml_diff>
--- a/FRFRO_DEEP_ANALYSIS.docx
+++ b/FRFRO_DEEP_ANALYSIS.docx
@@ -22,7 +22,7 @@
           <w:sz w:val="52"/>
           <w:szCs w:val="52"/>
         </w:rPr>
-        <w:t xml:space="preserve">تحلیل فنی عمیق پروژه «زیبابان»</w:t>
+        <w:t xml:space="preserve">تحلیل فنی عمیق پروژه «فرفرو»</w:t>
       </w:r>
     </w:p>
     <w:p>
@@ -115,7 +115,7 @@
           <w:sz w:val="22"/>
           <w:szCs w:val="22"/>
         </w:rPr>
-        <w:t xml:space="preserve">زیبابان یک اپلیکیشن Next.js (App Router) است که چهار حوزهٔ کسب‌وکار را در یک محصول واحد ترکیب کرده: شبکهٔ اجتماعی نمایش نمونه‌کار (اکسپلور)، رزرو نوبت از سالن‌ها و آرتیست‌های مستقل، فروشگاه آنلاین لوازم آرایشی، و استودیوی تولید تصویر با هوش مصنوعی که با ارز داخلی «شل» شارژ می‌شود. پروژه به‌صورت تک‌نفره یا با کمک ابزارهای هوش مصنوعی و به‌صورت بسیار تکرارشونده (iterative) توسعه یافته — نشانه‌اش وجود نزدیک به ۲۰۰ اسکریپت آزمایشی/اصلاحی موقت در پوشهٔ scripts/ و سه سند داخلی زندهٔ ردیابی مشکلات (KNOWN_ISSUES.md، UX_ISSUES.md، UX_AUDIT_ZIBABAN.md) است که خودِ تیم توسعه نگه داشته.</w:t>
+        <w:t xml:space="preserve">فرفرو یک اپلیکیشن Next.js (App Router) است که چهار حوزهٔ کسب‌وکار را در یک محصول واحد ترکیب کرده: شبکهٔ اجتماعی نمایش نمونه‌کار (اکسپلور)، رزرو نوبت از سالن‌ها و آرتیست‌های مستقل، فروشگاه آنلاین لوازم آرایشی، و استودیوی تولید تصویر با هوش مصنوعی که با ارز داخلی «شل» شارژ می‌شود. پروژه به‌صورت تک‌نفره یا با کمک ابزارهای هوش مصنوعی و به‌صورت بسیار تکرارشونده (iterative) توسعه یافته — نشانه‌اش وجود نزدیک به ۲۰۰ اسکریپت آزمایشی/اصلاحی موقت در پوشهٔ scripts/ و سه سند داخلی زندهٔ ردیابی مشکلات (KNOWN_ISSUES.md، UX_ISSUES.md، UX_AUDIT_FRFRO.md) است که خودِ تیم توسعه نگه داشته.</w:t>
       </w:r>
     </w:p>
     <w:p>
@@ -238,7 +238,7 @@
           <w:sz w:val="22"/>
           <w:szCs w:val="22"/>
         </w:rPr>
-        <w:t xml:space="preserve">لایهٔ داده: ماژول تجربی node:sqlite (DatabaseSync) به‌جای کتابخانهٔ بالغ‌تر better-sqlite3؛ یک فایل SQLite واحد در data/zibaban.sqlite با PRAGMA journal_mode=WAL</w:t>
+        <w:t xml:space="preserve">لایهٔ داده: ماژول تجربی node:sqlite (DatabaseSync) به‌جای کتابخانهٔ بالغ‌تر better-sqlite3؛ یک فایل SQLite واحد در data/frfro.sqlite با PRAGMA journal_mode=WAL</w:t>
       </w:r>
     </w:p>
     <w:p>
@@ -1998,7 +1998,7 @@
           <w:sz w:val="22"/>
           <w:szCs w:val="22"/>
         </w:rPr>
-        <w:t xml:space="preserve">این مسیر را کاملاً از بیلد پروداکشن حذف کنید (نه فقط پشت یک if)، یا حداقل پشت یک فلگ جداگانه و صریح (مثل ZIBABAN_ENABLE_DEMO_CREDIT=1) به‌همراه لاگ حسابرسی (audit log) قرار دهید که هرگز به‌طور پیش‌فرض روشن نباشد.</w:t>
+        <w:t xml:space="preserve">این مسیر را کاملاً از بیلد پروداکشن حذف کنید (نه فقط پشت یک if)، یا حداقل پشت یک فلگ جداگانه و صریح (مثل FRFRO_ENABLE_DEMO_CREDIT=1) به‌همراه لاگ حسابرسی (audit log) قرار دهید که هرگز به‌طور پیش‌فرض روشن نباشد.</w:t>
       </w:r>
     </w:p>
     <w:p>
@@ -2565,7 +2565,7 @@
           <w:sz w:val="22"/>
           <w:szCs w:val="22"/>
         </w:rPr>
-        <w:t xml:space="preserve">data/zibaban.sqlite حدود ۱۶۸ مگابایت است (به‌همراه ~۱۰ مگابایت فایل WAL) — رقمی که برای دامنهٔ فعلی جداول (کاربران، رزروها، پیام‌ها، تراکنش‌های کیف‌پول) بسیار بزرگ به نظر می‌رسد، مخصوصاً که ستون‌های image/avatar در schema از نوع TEXT هستند (مستعد ذخیرهٔ base64 در صورت عدم استفاده از فایل/URL). گزارش UX_AUDIT_ZIBABAN.md نیز مستقل شواهدی از دادهٔ آزمایشیِ رهاشده در همین DB را ثبت کرده (عنوان‌های بی‌معنی مثل «یسشبشس»، مخاطبین انگلیسی ساختگی). امکان بازرسی مستقیم فایل در این نشست به‌دلیل محدودیت زمانیِ انتقال فایل (device shell کاربر در دسترس نبود) فراهم نشد؛ این یک فرضیه است، نه یافتهٔ تأییدشده.</w:t>
+        <w:t xml:space="preserve">data/frfro.sqlite حدود ۱۶۸ مگابایت است (به‌همراه ~۱۰ مگابایت فایل WAL) — رقمی که برای دامنهٔ فعلی جداول (کاربران، رزروها، پیام‌ها، تراکنش‌های کیف‌پول) بسیار بزرگ به نظر می‌رسد، مخصوصاً که ستون‌های image/avatar در schema از نوع TEXT هستند (مستعد ذخیرهٔ base64 در صورت عدم استفاده از فایل/URL). گزارش UX_AUDIT_FRFRO.md نیز مستقل شواهدی از دادهٔ آزمایشیِ رهاشده در همین DB را ثبت کرده (عنوان‌های بی‌معنی مثل «یسشبشس»، مخاطبین انگلیسی ساختگی). امکان بازرسی مستقیم فایل در این نشست به‌دلیل محدودیت زمانیِ انتقال فایل (device shell کاربر در دسترس نبود) فراهم نشد؛ این یک فرضیه است، نه یافتهٔ تأییدشده.</w:t>
       </w:r>
     </w:p>
     <w:p>
@@ -2737,7 +2737,7 @@
           <w:sz w:val="22"/>
           <w:szCs w:val="22"/>
         </w:rPr>
-        <w:t xml:space="preserve">شل روی دستگاه کاربر در این نشست بالا نیامد؛ بنابراین git log و git status اجرا نشدند و ادعایی دربارهٔ تعداد commitها، شاخه‌ها، یا اینکه آیا فایل‌های حجیم/حساس (مثل data/zibaban.sqlite در صورت عدم‌رعایت .gitignore در گذشته) وارد تاریخچهٔ Git شده‌اند یا نه، در این گزارش نیامده. توصیه می‌شود جداگانه git log --stat | tail و du -sh .git بررسی شود؛ اگر دیتابیس یا لاگ‌ها زمانی commit شده‌اند، فقط حذف فایل کافی نیست و پاکسازی تاریخچه (مثلاً با git filter-repo) لازم است.</w:t>
+        <w:t xml:space="preserve">شل روی دستگاه کاربر در این نشست بالا نیامد؛ بنابراین git log و git status اجرا نشدند و ادعایی دربارهٔ تعداد commitها، شاخه‌ها، یا اینکه آیا فایل‌های حجیم/حساس (مثل data/frfro.sqlite در صورت عدم‌رعایت .gitignore در گذشته) وارد تاریخچهٔ Git شده‌اند یا نه، در این گزارش نیامده. توصیه می‌شود جداگانه git log --stat | tail و du -sh .git بررسی شود؛ اگر دیتابیس یا لاگ‌ها زمانی commit شده‌اند، فقط حذف فایل کافی نیست و پاکسازی تاریخچه (مثلاً با git filter-repo) لازم است.</w:t>
       </w:r>
     </w:p>
     <w:p>
@@ -2959,7 +2959,7 @@
           <w:sz w:val="22"/>
           <w:szCs w:val="22"/>
         </w:rPr>
-        <w:t xml:space="preserve">تیم توسعه سه سند زندهٔ ردیابی مشکلات (KNOWN_ISSUES.md، UX_ISSUES.md، UX_AUDIT_ZIBABAN.md) نگه می‌دارد و مشکلات رفع‌شده را با تاریخ و روش تست مستند می‌کند — نظمی که در بسیاری پروژه‌های تک‌نفره دیده نمی‌شود.</w:t>
+        <w:t xml:space="preserve">تیم توسعه سه سند زندهٔ ردیابی مشکلات (KNOWN_ISSUES.md، UX_ISSUES.md، UX_AUDIT_FRFRO.md) نگه می‌دارد و مشکلات رفع‌شده را با تاریخ و روش تست مستند می‌کند — نظمی که در بسیاری پروژه‌های تک‌نفره دیده نمی‌شود.</w:t>
       </w:r>
     </w:p>
     <w:p>
@@ -3000,7 +3000,7 @@
           <w:sz w:val="22"/>
           <w:szCs w:val="22"/>
         </w:rPr>
-        <w:t xml:space="preserve">این پروژه از پیش یک ممیزی تجربهٔ کاربریِ ۱۹ صفحه‌ای دارد (UX_AUDIT_ZIBABAN.md) که با بازدید واقعی از اپ در دو چیدمان دسکتاپ و موبایل انجام شده. جدول زیر امتیازهای کلیدی آن را خلاصه می‌کند:</w:t>
+        <w:t xml:space="preserve">این پروژه از پیش یک ممیزی تجربهٔ کاربریِ ۱۹ صفحه‌ای دارد (UX_AUDIT_FRFRO.md) که با بازدید واقعی از اپ در دو چیدمان دسکتاپ و موبایل انجام شده. جدول زیر امتیازهای کلیدی آن را خلاصه می‌کند:</w:t>
       </w:r>
     </w:p>
     <w:tbl>
@@ -3823,7 +3823,7 @@
           <w:sz w:val="22"/>
           <w:szCs w:val="22"/>
         </w:rPr>
-        <w:t xml:space="preserve">جزئیات کامل هر صفحه، امتیاز، و اولویت رفع در فایل UX_AUDIT_ZIBABAN.md موجود در ریشهٔ پروژه ثبت شده و در این گزارش تکرار نشده تا از دوباره‌کاری پرهیز شود.</w:t>
+        <w:t xml:space="preserve">جزئیات کامل هر صفحه، امتیاز، و اولویت رفع در فایل UX_AUDIT_FRFRO.md موجود در ریشهٔ پروژه ثبت شده و در این گزارش تکرار نشده تا از دوباره‌کاری پرهیز شود.</w:t>
       </w:r>
     </w:p>
     <w:p>

</xml_diff>